<commit_message>
Update client manual for live ops and Wati utility strategy
</commit_message>
<xml_diff>
--- a/platform/docs/client-handoff/MANUEL-UTILISATION-COMPLET-CHALLENGE-AMAZON-FBA.docx
+++ b/platform/docs/client-handoff/MANUEL-UTILISATION-COMPLET-CHALLENGE-AMAZON-FBA.docx
@@ -134,7 +134,7 @@
               <w:rPr>
                 <w:sz w:val="19"/>
               </w:rPr>
-              <w:t>27/05/2026</w:t>
+              <w:t>28/05/2026</w:t>
             </w:r>
           </w:p>
         </w:tc>
@@ -216,7 +216,7 @@
               <w:rPr>
                 <w:sz w:val="19"/>
               </w:rPr>
-              <w:t>origin/master == local HEAD 6239425</w:t>
+              <w:t>origin/master == local HEAD 8498f5a</w:t>
             </w:r>
           </w:p>
         </w:tc>
@@ -860,7 +860,7 @@
           </w:tcPr>
           <w:p>
             <w:r>
-              <w:t>Saisir la bonne edition, les liens, inscrits et presents</w:t>
+              <w:t>Saisir la bonne edition, les liens, inscrits et presents StreamYard</w:t>
             </w:r>
           </w:p>
         </w:tc>
@@ -3075,7 +3075,113 @@
           </w:tcPr>
           <w:p>
             <w:r>
-              <w:t>Verifier que les inscriptions Systeme.io alimentent bien la base.</w:t>
+              <w:t>Verifier que les inscriptions Systeme.io alimentent bien la base. Ce nombre n'est pas le nombre eligible broadcast.</w:t>
+            </w:r>
+          </w:p>
+        </w:tc>
+      </w:tr>
+      <w:tr>
+        <w:tc>
+          <w:tcPr>
+            <w:tcW w:type="dxa" w:w="2376"/>
+            <w:tcMar>
+              <w:top w:w="100" w:type="dxa"/>
+              <w:start w:w="120" w:type="dxa"/>
+              <w:bottom w:w="100" w:type="dxa"/>
+              <w:end w:w="120" w:type="dxa"/>
+            </w:tcMar>
+            <w:vAlign w:val="center"/>
+          </w:tcPr>
+          <w:p>
+            <w:r>
+              <w:t>Inscrits campagne</w:t>
+            </w:r>
+          </w:p>
+        </w:tc>
+        <w:tc>
+          <w:tcPr>
+            <w:tcW w:type="dxa" w:w="3240"/>
+            <w:tcMar>
+              <w:top w:w="100" w:type="dxa"/>
+              <w:start w:w="120" w:type="dxa"/>
+              <w:bottom w:w="100" w:type="dxa"/>
+              <w:end w:w="120" w:type="dxa"/>
+            </w:tcMar>
+            <w:vAlign w:val="center"/>
+          </w:tcPr>
+          <w:p>
+            <w:r>
+              <w:t>Nombre de contacts rattaches a une edition/parcours.</w:t>
+            </w:r>
+          </w:p>
+        </w:tc>
+        <w:tc>
+          <w:tcPr>
+            <w:tcW w:type="dxa" w:w="3744"/>
+            <w:tcMar>
+              <w:top w:w="100" w:type="dxa"/>
+              <w:start w:w="120" w:type="dxa"/>
+              <w:bottom w:w="100" w:type="dxa"/>
+              <w:end w:w="120" w:type="dxa"/>
+            </w:tcMar>
+            <w:vAlign w:val="center"/>
+          </w:tcPr>
+          <w:p>
+            <w:r>
+              <w:t>C'est ce compteur qui indique qui peut recevoir les broadcasts automatiques.</w:t>
+            </w:r>
+          </w:p>
+        </w:tc>
+      </w:tr>
+      <w:tr>
+        <w:tc>
+          <w:tcPr>
+            <w:tcW w:type="dxa" w:w="2376"/>
+            <w:tcMar>
+              <w:top w:w="100" w:type="dxa"/>
+              <w:start w:w="120" w:type="dxa"/>
+              <w:bottom w:w="100" w:type="dxa"/>
+              <w:end w:w="120" w:type="dxa"/>
+            </w:tcMar>
+            <w:vAlign w:val="center"/>
+          </w:tcPr>
+          <w:p>
+            <w:r>
+              <w:t>Alerte contacts sans inscription campagne</w:t>
+            </w:r>
+          </w:p>
+        </w:tc>
+        <w:tc>
+          <w:tcPr>
+            <w:tcW w:type="dxa" w:w="3240"/>
+            <w:tcMar>
+              <w:top w:w="100" w:type="dxa"/>
+              <w:start w:w="120" w:type="dxa"/>
+              <w:bottom w:w="100" w:type="dxa"/>
+              <w:end w:w="120" w:type="dxa"/>
+            </w:tcMar>
+            <w:vAlign w:val="center"/>
+          </w:tcPr>
+          <w:p>
+            <w:r>
+              <w:t>Contacts en base non rattaches a une edition.</w:t>
+            </w:r>
+          </w:p>
+        </w:tc>
+        <w:tc>
+          <w:tcPr>
+            <w:tcW w:type="dxa" w:w="3744"/>
+            <w:tcMar>
+              <w:top w:w="100" w:type="dxa"/>
+              <w:start w:w="120" w:type="dxa"/>
+              <w:bottom w:w="100" w:type="dxa"/>
+              <w:end w:w="120" w:type="dxa"/>
+            </w:tcMar>
+            <w:vAlign w:val="center"/>
+          </w:tcPr>
+          <w:p>
+            <w:r>
+              <w:t>Corriger l'edition active ou demander au support de rattacher les contacts opt-in a la bonne edition.</w:t>
             </w:r>
           </w:p>
         </w:tc>
@@ -4017,7 +4123,7 @@
         <w:spacing w:after="60"/>
       </w:pPr>
       <w:r>
-        <w:t>Choisir Cohorte : US/CA ou EU.</w:t>
+        <w:t>Choisir Cohorte : US/CA ou EU. Si le challenge n'a qu'une cohorte USA, choisir toujours US/CA.</w:t>
       </w:r>
     </w:p>
     <w:p>
@@ -4026,7 +4132,7 @@
         <w:spacing w:after="60"/>
       </w:pPr>
       <w:r>
-        <w:t>Saisir edition_key au format conseille : AAAA-MM-JJ-usca ou AAAA-MM-JJ-eu.</w:t>
+        <w:t>Saisir edition_key au format obligatoire : AAAA-MM-JJ-usca ou AAAA-MM-JJ-eu. Exemple reel : 2026-05-28-usca.</w:t>
       </w:r>
     </w:p>
     <w:p>
@@ -4035,7 +4141,7 @@
         <w:spacing w:after="60"/>
       </w:pPr>
       <w:r>
-        <w:t>Choisir Jour 1, Jour 2 ou Jour 3.</w:t>
+        <w:t>Choisir Jour 1, Jour 2 ou Jour 3 selon le lien ou la liste que l'on va enregistrer.</w:t>
       </w:r>
     </w:p>
     <w:p>
@@ -4109,9 +4215,62 @@
               <w:rPr>
                 <w:sz w:val="19"/>
               </w:rPr>
-              <w:t>- Saisir un titre commercial a la place de l'edition_key.</w:t>
+              <w:t>- Saisir un titre commercial a la place de l'edition_key, par exemple 'L'OPPORTUNITE AMAZON FBA'.</w:t>
               <w:br/>
               <w:t>- Melanger EU et US-CA avec la meme edition.</w:t>
+              <w:br/>
+              <w:t>- Changer l'edition_key entre jour 1, jour 2 et jour 3.</w:t>
+            </w:r>
+          </w:p>
+        </w:tc>
+      </w:tr>
+    </w:tbl>
+    <w:tbl>
+      <w:tblPr>
+        <w:tblStyle w:val="TableGrid"/>
+        <w:tblW w:type="auto" w:w="0"/>
+        <w:jc w:val="left"/>
+        <w:tblLayout w:type="fixed"/>
+        <w:tblLook w:firstColumn="1" w:firstRow="1" w:lastColumn="0" w:lastRow="0" w:noHBand="0" w:noVBand="1" w:val="04A0"/>
+      </w:tblPr>
+      <w:tblGrid>
+        <w:gridCol w:w="9792"/>
+      </w:tblGrid>
+      <w:tr>
+        <w:tc>
+          <w:tcPr>
+            <w:tcW w:type="dxa" w:w="9792"/>
+            <w:tcMar>
+              <w:top w:w="100" w:type="dxa"/>
+              <w:start w:w="120" w:type="dxa"/>
+              <w:bottom w:w="100" w:type="dxa"/>
+              <w:end w:w="120" w:type="dxa"/>
+            </w:tcMar>
+            <w:vAlign w:val="center"/>
+            <w:shd w:fill="FFF7DB"/>
+          </w:tcPr>
+          <w:p>
+            <w:pPr>
+              <w:spacing w:after="40"/>
+            </w:pPr>
+            <w:r>
+              <w:rPr>
+                <w:b/>
+                <w:color w:val="0B2545"/>
+                <w:sz w:val="21"/>
+              </w:rPr>
+              <w:t>Exemple concret pour une cohorte USA</w:t>
+            </w:r>
+          </w:p>
+          <w:p>
+            <w:pPr>
+              <w:spacing w:after="0"/>
+            </w:pPr>
+            <w:r>
+              <w:rPr>
+                <w:sz w:val="19"/>
+              </w:rPr>
+              <w:t>Si le challenge commence le 28/05/2026 et qu'il n'y a qu'une cohorte USA, utiliser Cohorte = US/CA et Edition key = 2026-05-28-usca partout : live jour 1, live jour 2, live jour 3, replays, lien paiement, inscrits StreamYard et presents StreamYard.</w:t>
             </w:r>
           </w:p>
         </w:tc>
@@ -4274,7 +4433,7 @@
         <w:spacing w:after="60"/>
       </w:pPr>
       <w:r>
-        <w:t>Coller le lien dans 'Lien StreamYard'.</w:t>
+        <w:t>Choisir Jour 1, coller le lien jour 1, puis cliquer sur 'Enregistrer le live'.</w:t>
       </w:r>
     </w:p>
     <w:p>
@@ -4283,7 +4442,7 @@
         <w:spacing w:after="60"/>
       </w:pPr>
       <w:r>
-        <w:t>Cliquer sur 'Enregistrer le live'.</w:t>
+        <w:t>Choisir Jour 2, remplacer par le lien jour 2, puis cliquer sur 'Enregistrer le live'.</w:t>
       </w:r>
     </w:p>
     <w:p>
@@ -4292,7 +4451,16 @@
         <w:spacing w:after="60"/>
       </w:pPr>
       <w:r>
-        <w:t>Lire le message de succes.</w:t>
+        <w:t>Choisir Jour 3, remplacer par le lien jour 3, puis cliquer sur 'Enregistrer le live'.</w:t>
+      </w:r>
+    </w:p>
+    <w:p>
+      <w:pPr>
+        <w:pStyle w:val="ListNumber"/>
+        <w:spacing w:after="60"/>
+      </w:pPr>
+      <w:r>
+        <w:t>Lire le message de succes apres chaque jour.</w:t>
       </w:r>
     </w:p>
     <w:p>
@@ -4894,6 +5062,59 @@
               <w:t>- Envoyer les presents dans cette section.</w:t>
               <w:br/>
               <w:t>- Importer un CSV qui ne contient pas les numeros de telephone.</w:t>
+              <w:br/>
+              <w:t>- Utiliser cette section pour rattacher les contacts Systeme.io au parcours. Les contacts Systeme.io sont geres par l'inscription campagne, pas par cette zone.</w:t>
+            </w:r>
+          </w:p>
+        </w:tc>
+      </w:tr>
+    </w:tbl>
+    <w:tbl>
+      <w:tblPr>
+        <w:tblStyle w:val="TableGrid"/>
+        <w:tblW w:type="auto" w:w="0"/>
+        <w:jc w:val="left"/>
+        <w:tblLayout w:type="fixed"/>
+        <w:tblLook w:firstColumn="1" w:firstRow="1" w:lastColumn="0" w:lastRow="0" w:noHBand="0" w:noVBand="1" w:val="04A0"/>
+      </w:tblPr>
+      <w:tblGrid>
+        <w:gridCol w:w="9792"/>
+      </w:tblGrid>
+      <w:tr>
+        <w:tc>
+          <w:tcPr>
+            <w:tcW w:type="dxa" w:w="9792"/>
+            <w:tcMar>
+              <w:top w:w="100" w:type="dxa"/>
+              <w:start w:w="120" w:type="dxa"/>
+              <w:bottom w:w="100" w:type="dxa"/>
+              <w:end w:w="120" w:type="dxa"/>
+            </w:tcMar>
+            <w:vAlign w:val="center"/>
+            <w:shd w:fill="FFF7DB"/>
+          </w:tcPr>
+          <w:p>
+            <w:pPr>
+              <w:spacing w:after="40"/>
+            </w:pPr>
+            <w:r>
+              <w:rPr>
+                <w:b/>
+                <w:color w:val="0B2545"/>
+                <w:sz w:val="21"/>
+              </w:rPr>
+              <w:t>Attention : Systeme.io et StreamYard ne sont pas la meme liste</w:t>
+            </w:r>
+          </w:p>
+          <w:p>
+            <w:pPr>
+              <w:spacing w:after="0"/>
+            </w:pPr>
+            <w:r>
+              <w:rPr>
+                <w:sz w:val="19"/>
+              </w:rPr>
+              <w:t>Les blocs 'Envoyer les inscrits' et 'Envoyer les presents' concernent uniquement les listes exportees depuis StreamYard. Ils ne servent pas a ajouter les contacts Systeme.io dans la sequence broadcast. Si la zone affiche 'Numeros detectes : 0', cela signifie qu'aucun vrai numero n'a ete colle ou importe; le texte visible dans la zone est seulement un exemple.</w:t>
             </w:r>
           </w:p>
         </w:tc>
@@ -5489,6 +5710,57 @@
         </w:tc>
       </w:tr>
     </w:tbl>
+    <w:tbl>
+      <w:tblPr>
+        <w:tblStyle w:val="TableGrid"/>
+        <w:tblW w:type="auto" w:w="0"/>
+        <w:jc w:val="left"/>
+        <w:tblLayout w:type="fixed"/>
+        <w:tblLook w:firstColumn="1" w:firstRow="1" w:lastColumn="0" w:lastRow="0" w:noHBand="0" w:noVBand="1" w:val="04A0"/>
+      </w:tblPr>
+      <w:tblGrid>
+        <w:gridCol w:w="9792"/>
+      </w:tblGrid>
+      <w:tr>
+        <w:tc>
+          <w:tcPr>
+            <w:tcW w:type="dxa" w:w="9792"/>
+            <w:tcMar>
+              <w:top w:w="100" w:type="dxa"/>
+              <w:start w:w="120" w:type="dxa"/>
+              <w:bottom w:w="100" w:type="dxa"/>
+              <w:end w:w="120" w:type="dxa"/>
+            </w:tcMar>
+            <w:vAlign w:val="center"/>
+            <w:shd w:fill="FDECEC"/>
+          </w:tcPr>
+          <w:p>
+            <w:pPr>
+              <w:spacing w:after="40"/>
+            </w:pPr>
+            <w:r>
+              <w:rPr>
+                <w:b/>
+                <w:color w:val="0B2545"/>
+                <w:sz w:val="21"/>
+              </w:rPr>
+              <w:t>Restriction connue : numeros +1 et templates MARKETING</w:t>
+            </w:r>
+          </w:p>
+          <w:p>
+            <w:pPr>
+              <w:spacing w:after="0"/>
+            </w:pPr>
+            <w:r>
+              <w:rPr>
+                <w:sz w:val="19"/>
+              </w:rPr>
+              <w:t>Depuis la restriction Meta sur les templates marketing vers les numeros US (+1), un template Wati approuve en categorie MARKETING peut etre refuse pour certains destinataires +1. Dans ce cas, le systeme conserve le contact au meme current_step afin d'eviter une progression artificielle. La correction durable consiste a creer des rappels live en categorie UTILITY lorsque le contenu le permet.</w:t>
+            </w:r>
+          </w:p>
+        </w:tc>
+      </w:tr>
+    </w:tbl>
     <w:p>
       <w:pPr>
         <w:pStyle w:val="Heading2"/>
@@ -6450,6 +6722,15 @@
       </w:pPr>
       <w:r>
         <w:t>Verifier que Wati est connecte et que les templates necessaires sont approuves.</w:t>
+      </w:r>
+    </w:p>
+    <w:p>
+      <w:pPr>
+        <w:pStyle w:val="ListNumber"/>
+        <w:spacing w:after="60"/>
+      </w:pPr>
+      <w:r>
+        <w:t>Verifier la categorie Wati des templates live. Pour les destinataires +1, privilegier des templates UTILITY strictement informatifs si Meta/Wati les approuve.</w:t>
       </w:r>
     </w:p>
     <w:p>
@@ -7066,6 +7347,463 @@
           <w:p>
             <w:r>
               <w:t>Verifier que le code ne progresse plus sur status failed et relancer seulement l'edition concernee.</w:t>
+            </w:r>
+          </w:p>
+        </w:tc>
+      </w:tr>
+    </w:tbl>
+    <w:p>
+      <w:pPr>
+        <w:pStyle w:val="Heading2"/>
+      </w:pPr>
+      <w:r>
+        <w:t>8.1 Methode Utility pour les rappels live US</w:t>
+      </w:r>
+    </w:p>
+    <w:tbl>
+      <w:tblPr>
+        <w:tblStyle w:val="TableGrid"/>
+        <w:tblW w:type="auto" w:w="0"/>
+        <w:jc w:val="left"/>
+        <w:tblLayout w:type="fixed"/>
+        <w:tblLook w:firstColumn="1" w:firstRow="1" w:lastColumn="0" w:lastRow="0" w:noHBand="0" w:noVBand="1" w:val="04A0"/>
+      </w:tblPr>
+      <w:tblGrid>
+        <w:gridCol w:w="9792"/>
+      </w:tblGrid>
+      <w:tr>
+        <w:tc>
+          <w:tcPr>
+            <w:tcW w:type="dxa" w:w="9792"/>
+            <w:tcMar>
+              <w:top w:w="100" w:type="dxa"/>
+              <w:start w:w="120" w:type="dxa"/>
+              <w:bottom w:w="100" w:type="dxa"/>
+              <w:end w:w="120" w:type="dxa"/>
+            </w:tcMar>
+            <w:vAlign w:val="center"/>
+            <w:shd w:fill="EAF7F0"/>
+          </w:tcPr>
+          <w:p>
+            <w:pPr>
+              <w:spacing w:after="40"/>
+            </w:pPr>
+            <w:r>
+              <w:rPr>
+                <w:b/>
+                <w:color w:val="0B2545"/>
+                <w:sz w:val="21"/>
+              </w:rPr>
+              <w:t>Objectif</w:t>
+            </w:r>
+          </w:p>
+          <w:p>
+            <w:pPr>
+              <w:spacing w:after="0"/>
+            </w:pPr>
+            <w:r>
+              <w:rPr>
+                <w:sz w:val="19"/>
+              </w:rPr>
+              <w:t>Permettre aux numeros US/CA (+1) de recevoir les informations pratiques du live lorsque les templates marketing sont refuses par Meta/Wati. La methode ne consiste pas a contourner Meta : elle consiste a soumettre des messages reellement transactionnels/informatifs, sans promesse commerciale.</w:t>
+            </w:r>
+          </w:p>
+        </w:tc>
+      </w:tr>
+    </w:tbl>
+    <w:tbl>
+      <w:tblPr>
+        <w:tblStyle w:val="TableGrid"/>
+        <w:tblW w:type="auto" w:w="0"/>
+        <w:jc w:val="left"/>
+        <w:tblLayout w:type="fixed"/>
+        <w:tblLook w:firstColumn="1" w:firstRow="1" w:lastColumn="0" w:lastRow="0" w:noHBand="0" w:noVBand="1" w:val="04A0"/>
+      </w:tblPr>
+      <w:tblGrid>
+        <w:gridCol w:w="3264"/>
+        <w:gridCol w:w="3264"/>
+        <w:gridCol w:w="3264"/>
+      </w:tblGrid>
+      <w:tr>
+        <w:trPr>
+          <w:tblHeader w:val="true"/>
+        </w:trPr>
+        <w:tc>
+          <w:tcPr>
+            <w:tcW w:type="dxa" w:w="1944"/>
+            <w:tcMar>
+              <w:top w:w="100" w:type="dxa"/>
+              <w:start w:w="120" w:type="dxa"/>
+              <w:bottom w:w="100" w:type="dxa"/>
+              <w:end w:w="120" w:type="dxa"/>
+            </w:tcMar>
+            <w:vAlign w:val="center"/>
+            <w:shd w:fill="E8EEF5"/>
+          </w:tcPr>
+          <w:p>
+            <w:r>
+              <w:rPr>
+                <w:b/>
+              </w:rPr>
+              <w:t>Regle</w:t>
+            </w:r>
+          </w:p>
+        </w:tc>
+        <w:tc>
+          <w:tcPr>
+            <w:tcW w:type="dxa" w:w="3960"/>
+            <w:tcMar>
+              <w:top w:w="100" w:type="dxa"/>
+              <w:start w:w="120" w:type="dxa"/>
+              <w:bottom w:w="100" w:type="dxa"/>
+              <w:end w:w="120" w:type="dxa"/>
+            </w:tcMar>
+            <w:vAlign w:val="center"/>
+            <w:shd w:fill="E8EEF5"/>
+          </w:tcPr>
+          <w:p>
+            <w:r>
+              <w:rPr>
+                <w:b/>
+              </w:rPr>
+              <w:t>A faire</w:t>
+            </w:r>
+          </w:p>
+        </w:tc>
+        <w:tc>
+          <w:tcPr>
+            <w:tcW w:type="dxa" w:w="3456"/>
+            <w:tcMar>
+              <w:top w:w="100" w:type="dxa"/>
+              <w:start w:w="120" w:type="dxa"/>
+              <w:bottom w:w="100" w:type="dxa"/>
+              <w:end w:w="120" w:type="dxa"/>
+            </w:tcMar>
+            <w:vAlign w:val="center"/>
+            <w:shd w:fill="E8EEF5"/>
+          </w:tcPr>
+          <w:p>
+            <w:r>
+              <w:rPr>
+                <w:b/>
+              </w:rPr>
+              <w:t>A eviter</w:t>
+            </w:r>
+          </w:p>
+        </w:tc>
+      </w:tr>
+      <w:tr>
+        <w:tc>
+          <w:tcPr>
+            <w:tcW w:type="dxa" w:w="1944"/>
+            <w:tcMar>
+              <w:top w:w="100" w:type="dxa"/>
+              <w:start w:w="120" w:type="dxa"/>
+              <w:bottom w:w="100" w:type="dxa"/>
+              <w:end w:w="120" w:type="dxa"/>
+            </w:tcMar>
+            <w:vAlign w:val="center"/>
+          </w:tcPr>
+          <w:p>
+            <w:r>
+              <w:t>Intention</w:t>
+            </w:r>
+          </w:p>
+        </w:tc>
+        <w:tc>
+          <w:tcPr>
+            <w:tcW w:type="dxa" w:w="3960"/>
+            <w:tcMar>
+              <w:top w:w="100" w:type="dxa"/>
+              <w:start w:w="120" w:type="dxa"/>
+              <w:bottom w:w="100" w:type="dxa"/>
+              <w:end w:w="120" w:type="dxa"/>
+            </w:tcMar>
+            <w:vAlign w:val="center"/>
+          </w:tcPr>
+          <w:p>
+            <w:r>
+              <w:t>Confirmer l'acces a un live auquel la personne s'est inscrite.</w:t>
+            </w:r>
+          </w:p>
+        </w:tc>
+        <w:tc>
+          <w:tcPr>
+            <w:tcW w:type="dxa" w:w="3456"/>
+            <w:tcMar>
+              <w:top w:w="100" w:type="dxa"/>
+              <w:start w:w="120" w:type="dxa"/>
+              <w:bottom w:w="100" w:type="dxa"/>
+              <w:end w:w="120" w:type="dxa"/>
+            </w:tcMar>
+            <w:vAlign w:val="center"/>
+          </w:tcPr>
+          <w:p>
+            <w:r>
+              <w:t>Vendre, convaincre, relancer commercialement.</w:t>
+            </w:r>
+          </w:p>
+        </w:tc>
+      </w:tr>
+      <w:tr>
+        <w:tc>
+          <w:tcPr>
+            <w:tcW w:type="dxa" w:w="1944"/>
+            <w:tcMar>
+              <w:top w:w="100" w:type="dxa"/>
+              <w:start w:w="120" w:type="dxa"/>
+              <w:bottom w:w="100" w:type="dxa"/>
+              <w:end w:w="120" w:type="dxa"/>
+            </w:tcMar>
+            <w:vAlign w:val="center"/>
+          </w:tcPr>
+          <w:p>
+            <w:r>
+              <w:t>Texte</w:t>
+            </w:r>
+          </w:p>
+        </w:tc>
+        <w:tc>
+          <w:tcPr>
+            <w:tcW w:type="dxa" w:w="3960"/>
+            <w:tcMar>
+              <w:top w:w="100" w:type="dxa"/>
+              <w:start w:w="120" w:type="dxa"/>
+              <w:bottom w:w="100" w:type="dxa"/>
+              <w:end w:w="120" w:type="dxa"/>
+            </w:tcMar>
+            <w:vAlign w:val="center"/>
+          </w:tcPr>
+          <w:p>
+            <w:r>
+              <w:t>Formulation neutre : lien, heure, rappel pratique.</w:t>
+            </w:r>
+          </w:p>
+        </w:tc>
+        <w:tc>
+          <w:tcPr>
+            <w:tcW w:type="dxa" w:w="3456"/>
+            <w:tcMar>
+              <w:top w:w="100" w:type="dxa"/>
+              <w:start w:w="120" w:type="dxa"/>
+              <w:bottom w:w="100" w:type="dxa"/>
+              <w:end w:w="120" w:type="dxa"/>
+            </w:tcMar>
+            <w:vAlign w:val="center"/>
+          </w:tcPr>
+          <w:p>
+            <w:r>
+              <w:t>Mots comme opportunite, offre, dernier moment, gagnez, transformez votre business.</w:t>
+            </w:r>
+          </w:p>
+        </w:tc>
+      </w:tr>
+      <w:tr>
+        <w:tc>
+          <w:tcPr>
+            <w:tcW w:type="dxa" w:w="1944"/>
+            <w:tcMar>
+              <w:top w:w="100" w:type="dxa"/>
+              <w:start w:w="120" w:type="dxa"/>
+              <w:bottom w:w="100" w:type="dxa"/>
+              <w:end w:w="120" w:type="dxa"/>
+            </w:tcMar>
+            <w:vAlign w:val="center"/>
+          </w:tcPr>
+          <w:p>
+            <w:r>
+              <w:t>Variables</w:t>
+            </w:r>
+          </w:p>
+        </w:tc>
+        <w:tc>
+          <w:tcPr>
+            <w:tcW w:type="dxa" w:w="3960"/>
+            <w:tcMar>
+              <w:top w:w="100" w:type="dxa"/>
+              <w:start w:w="120" w:type="dxa"/>
+              <w:bottom w:w="100" w:type="dxa"/>
+              <w:end w:w="120" w:type="dxa"/>
+            </w:tcMar>
+            <w:vAlign w:val="center"/>
+          </w:tcPr>
+          <w:p>
+            <w:r>
+              <w:t>{{1}} prenom, {{2}} lien du live, {{3}} heure.</w:t>
+            </w:r>
+          </w:p>
+        </w:tc>
+        <w:tc>
+          <w:tcPr>
+            <w:tcW w:type="dxa" w:w="3456"/>
+            <w:tcMar>
+              <w:top w:w="100" w:type="dxa"/>
+              <w:start w:w="120" w:type="dxa"/>
+              <w:bottom w:w="100" w:type="dxa"/>
+              <w:end w:w="120" w:type="dxa"/>
+            </w:tcMar>
+            <w:vAlign w:val="center"/>
+          </w:tcPr>
+          <w:p>
+            <w:r>
+              <w:t>Ajouter un lien de paiement ou une promesse de resultat dans le rappel live.</w:t>
+            </w:r>
+          </w:p>
+        </w:tc>
+      </w:tr>
+      <w:tr>
+        <w:tc>
+          <w:tcPr>
+            <w:tcW w:type="dxa" w:w="1944"/>
+            <w:tcMar>
+              <w:top w:w="100" w:type="dxa"/>
+              <w:start w:w="120" w:type="dxa"/>
+              <w:bottom w:w="100" w:type="dxa"/>
+              <w:end w:w="120" w:type="dxa"/>
+            </w:tcMar>
+            <w:vAlign w:val="center"/>
+          </w:tcPr>
+          <w:p>
+            <w:r>
+              <w:t>Ciblage</w:t>
+            </w:r>
+          </w:p>
+        </w:tc>
+        <w:tc>
+          <w:tcPr>
+            <w:tcW w:type="dxa" w:w="3960"/>
+            <w:tcMar>
+              <w:top w:w="100" w:type="dxa"/>
+              <w:start w:w="120" w:type="dxa"/>
+              <w:bottom w:w="100" w:type="dxa"/>
+              <w:end w:w="120" w:type="dxa"/>
+            </w:tcMar>
+            <w:vAlign w:val="center"/>
+          </w:tcPr>
+          <w:p>
+            <w:r>
+              <w:t>Utiliser Utility en priorite pour les numeros +1 si Wati l'approuve.</w:t>
+            </w:r>
+          </w:p>
+        </w:tc>
+        <w:tc>
+          <w:tcPr>
+            <w:tcW w:type="dxa" w:w="3456"/>
+            <w:tcMar>
+              <w:top w:w="100" w:type="dxa"/>
+              <w:start w:w="120" w:type="dxa"/>
+              <w:bottom w:w="100" w:type="dxa"/>
+              <w:end w:w="120" w:type="dxa"/>
+            </w:tcMar>
+            <w:vAlign w:val="center"/>
+          </w:tcPr>
+          <w:p>
+            <w:r>
+              <w:t>Envoyer en masse un template MARKETING aux +1 en esperant que Meta accepte.</w:t>
+            </w:r>
+          </w:p>
+        </w:tc>
+      </w:tr>
+      <w:tr>
+        <w:tc>
+          <w:tcPr>
+            <w:tcW w:type="dxa" w:w="1944"/>
+            <w:tcMar>
+              <w:top w:w="100" w:type="dxa"/>
+              <w:start w:w="120" w:type="dxa"/>
+              <w:bottom w:w="100" w:type="dxa"/>
+              <w:end w:w="120" w:type="dxa"/>
+            </w:tcMar>
+            <w:vAlign w:val="center"/>
+          </w:tcPr>
+          <w:p>
+            <w:r>
+              <w:t>Suivi</w:t>
+            </w:r>
+          </w:p>
+        </w:tc>
+        <w:tc>
+          <w:tcPr>
+            <w:tcW w:type="dxa" w:w="3960"/>
+            <w:tcMar>
+              <w:top w:w="100" w:type="dxa"/>
+              <w:start w:w="120" w:type="dxa"/>
+              <w:bottom w:w="100" w:type="dxa"/>
+              <w:end w:w="120" w:type="dxa"/>
+            </w:tcMar>
+            <w:vAlign w:val="center"/>
+          </w:tcPr>
+          <w:p>
+            <w:r>
+              <w:t>Relancer uniquement les contacts restes au step bloque apres failed.</w:t>
+            </w:r>
+          </w:p>
+        </w:tc>
+        <w:tc>
+          <w:tcPr>
+            <w:tcW w:type="dxa" w:w="3456"/>
+            <w:tcMar>
+              <w:top w:w="100" w:type="dxa"/>
+              <w:start w:w="120" w:type="dxa"/>
+              <w:bottom w:w="100" w:type="dxa"/>
+              <w:end w:w="120" w:type="dxa"/>
+            </w:tcMar>
+            <w:vAlign w:val="center"/>
+          </w:tcPr>
+          <w:p>
+            <w:r>
+              <w:t>Rejouer un broadcast global aux contacts deja passes au step suivant.</w:t>
+            </w:r>
+          </w:p>
+        </w:tc>
+      </w:tr>
+    </w:tbl>
+    <w:tbl>
+      <w:tblPr>
+        <w:tblStyle w:val="TableGrid"/>
+        <w:tblW w:type="auto" w:w="0"/>
+        <w:jc w:val="left"/>
+        <w:tblLayout w:type="fixed"/>
+        <w:tblLook w:firstColumn="1" w:firstRow="1" w:lastColumn="0" w:lastRow="0" w:noHBand="0" w:noVBand="1" w:val="04A0"/>
+      </w:tblPr>
+      <w:tblGrid>
+        <w:gridCol w:w="9792"/>
+      </w:tblGrid>
+      <w:tr>
+        <w:tc>
+          <w:tcPr>
+            <w:tcW w:type="dxa" w:w="9792"/>
+            <w:tcMar>
+              <w:top w:w="100" w:type="dxa"/>
+              <w:start w:w="120" w:type="dxa"/>
+              <w:bottom w:w="100" w:type="dxa"/>
+              <w:end w:w="120" w:type="dxa"/>
+            </w:tcMar>
+            <w:vAlign w:val="center"/>
+            <w:shd w:fill="F2F4F7"/>
+          </w:tcPr>
+          <w:p>
+            <w:pPr>
+              <w:spacing w:after="40"/>
+            </w:pPr>
+            <w:r>
+              <w:rPr>
+                <w:b/>
+                <w:color w:val="0B2545"/>
+                <w:sz w:val="21"/>
+              </w:rPr>
+              <w:t>Exemple de template Utility propose</w:t>
+            </w:r>
+          </w:p>
+          <w:p>
+            <w:pPr>
+              <w:spacing w:after="0"/>
+            </w:pPr>
+            <w:r>
+              <w:rPr>
+                <w:sz w:val="19"/>
+              </w:rPr>
+              <w:t>Bonjour {{1}}, voici votre acces au live du Challenge Amazon FBA auquel vous etes inscrit. Lien : {{2}}. Heure : {{3}}. Ce message est un rappel pratique lie a votre inscription.</w:t>
             </w:r>
           </w:p>
         </w:tc>

</xml_diff>